<commit_message>
content: use neutral Infoblox wording in DRV project
</commit_message>
<xml_diff>
--- a/public/uwe-schwarz-cv-de-2026-10-12.docx
+++ b/public/uwe-schwarz-cv-de-2026-10-12.docx
@@ -425,7 +425,7 @@
                 <w:sz w:val="20"/>
                 <w:szCs w:val="20"/>
               </w:rPr>
-              <w:t xml:space="preserve">Technische Programmleitung IPv6-Migration &amp; Infoblox IPAM</w:t>
+              <w:t xml:space="preserve">Technische Programmleitung IPv6-Migration &amp; IP-Adressmanagement mit Infoblox</w:t>
             </w:r>
           </w:p>
           <w:p>
@@ -494,7 +494,7 @@
                 <w:sz w:val="18"/>
                 <w:szCs w:val="18"/>
               </w:rPr>
-              <w:t xml:space="preserve">Konzeption der IPv6-Adressierung und Abstimmung der Abbildung in Infoblox IPAM als Grundlage für eine konsistente Verwaltung von Adressräumen und Netzsegmenten im Dual-Stack-Betrieb.</w:t>
+              <w:t xml:space="preserve">Konzeption der IPv6-Adressierung und Abstimmung der Abbildung in Infoblox als Grundlage für eine konsistente Verwaltung von Adressräumen und Netzsegmenten im Dual-Stack-Betrieb.</w:t>
             </w:r>
           </w:p>
           <w:p>

</xml_diff>

<commit_message>
content: use neutral Infoblox wording in DRV project (#287)
The German and English DRV project descriptions now use neutral wording
for IP address management with Infoblox, avoiding the implication that
"Infoblox IPAM" identifies a specific product. Updated both role titles
and the detailed addressing bullet, and split the technology tags into
"Infoblox" and "IPAM".

Regenerated all four German and English PDF/DOCX CV downloads with the
same changes.

Validation: `bun run lint`, `bun run typecheck`, `bun run format:check`,
`bun run doctor`, and `bun run build` passed. Inspected the regenerated
PDF and DOCX text in both languages.
</commit_message>
<xml_diff>
--- a/public/uwe-schwarz-cv-de-2026-10-12.docx
+++ b/public/uwe-schwarz-cv-de-2026-10-12.docx
@@ -425,7 +425,7 @@
                 <w:sz w:val="20"/>
                 <w:szCs w:val="20"/>
               </w:rPr>
-              <w:t xml:space="preserve">Technische Programmleitung IPv6-Migration &amp; Infoblox IPAM</w:t>
+              <w:t xml:space="preserve">Technische Programmleitung IPv6-Migration &amp; IP-Adressmanagement mit Infoblox</w:t>
             </w:r>
           </w:p>
           <w:p>
@@ -494,7 +494,7 @@
                 <w:sz w:val="18"/>
                 <w:szCs w:val="18"/>
               </w:rPr>
-              <w:t xml:space="preserve">Konzeption der IPv6-Adressierung und Abstimmung der Abbildung in Infoblox IPAM als Grundlage für eine konsistente Verwaltung von Adressräumen und Netzsegmenten im Dual-Stack-Betrieb.</w:t>
+              <w:t xml:space="preserve">Konzeption der IPv6-Adressierung und Abstimmung der Abbildung in Infoblox als Grundlage für eine konsistente Verwaltung von Adressräumen und Netzsegmenten im Dual-Stack-Betrieb.</w:t>
             </w:r>
           </w:p>
           <w:p>

</xml_diff>